<commit_message>
feat: add new templates to contract and sales categories
</commit_message>
<xml_diff>
--- a/public/templates/freelance-keiyaku.docx
+++ b/public/templates/freelance-keiyaku.docx
@@ -2503,28 +2503,48 @@
     </w:p>
     <w:p>
       <w:pPr>
-        <w:rPr>
-          <w:rFonts w:ascii="BIZ UDP明朝 Medium" w:eastAsia="BIZ UDP明朝 Medium" w:hAnsi="BIZ UDP明朝 Medium"/>
-        </w:rPr>
-      </w:pPr>
-      <w:r>
-        <w:rPr>
-          <w:rFonts w:ascii="BIZ UDP明朝 Medium" w:eastAsia="BIZ UDP明朝 Medium" w:hAnsi="BIZ UDP明朝 Medium" w:hint="eastAsia"/>
-        </w:rPr>
-        <w:t>以上、本契約の成立を証して、本書2通を作成し甲乙記名捺印の上、各1通保有する。</w:t>
-      </w:r>
-    </w:p>
-    <w:p>
-      <w:pPr>
         <w:tabs>
           <w:tab w:val="left" w:pos="1635"/>
         </w:tabs>
+        <w:rPr>
+          <w:rFonts w:ascii="BIZ UDP明朝 Medium" w:eastAsia="BIZ UDP明朝 Medium" w:hAnsi="BIZ UDP明朝 Medium"/>
+        </w:rPr>
+      </w:pPr>
+    </w:p>
+    <w:p>
+      <w:pPr>
+        <w:tabs>
+          <w:tab w:val="left" w:pos="1635"/>
+        </w:tabs>
+        <w:rPr>
+          <w:rFonts w:ascii="BIZ UDP明朝 Medium" w:eastAsia="BIZ UDP明朝 Medium" w:hAnsi="BIZ UDP明朝 Medium"/>
+        </w:rPr>
+      </w:pPr>
+    </w:p>
+    <w:p>
+      <w:pPr>
+        <w:rPr>
+          <w:rFonts w:ascii="BIZ UDP明朝 Medium" w:eastAsia="BIZ UDP明朝 Medium" w:hAnsi="BIZ UDP明朝 Medium" w:hint="eastAsia"/>
+        </w:rPr>
+      </w:pPr>
+      <w:r>
+        <w:rPr>
+          <w:rFonts w:ascii="BIZ UDP明朝 Medium" w:eastAsia="BIZ UDP明朝 Medium" w:hAnsi="BIZ UDP明朝 Medium" w:hint="eastAsia"/>
+        </w:rPr>
+        <w:lastRenderedPageBreak/>
+        <w:t>以上のとおり、が成立したので、これを証するため本契約書の電磁的記録を作成し、　甲及び乙が合意の後電子署名を施し、各自その電磁的記録を保管する。</w:t>
+      </w:r>
+    </w:p>
+    <w:p>
+      <w:pPr>
+        <w:tabs>
+          <w:tab w:val="left" w:pos="1635"/>
+        </w:tabs>
       </w:pPr>
       <w:r>
         <w:rPr>
           <w:rFonts w:hint="eastAsia"/>
         </w:rPr>
-        <w:lastRenderedPageBreak/>
         <w:t>2026年〇月1日</w:t>
       </w:r>
     </w:p>
@@ -2574,6 +2594,67 @@
       </w:pPr>
       <w:r>
         <w:rPr>
+          <w:rFonts w:ascii="BIZ UDP明朝 Medium" w:eastAsia="BIZ UDP明朝 Medium" w:hAnsi="BIZ UDP明朝 Medium"/>
+          <w:noProof/>
+        </w:rPr>
+        <w:drawing>
+          <wp:anchor distT="0" distB="0" distL="114300" distR="114300" simplePos="0" relativeHeight="251658240" behindDoc="0" locked="0" layoutInCell="1" allowOverlap="1" wp14:anchorId="3341BCB2" wp14:editId="25578381">
+            <wp:simplePos x="0" y="0"/>
+            <wp:positionH relativeFrom="column">
+              <wp:posOffset>4740269</wp:posOffset>
+            </wp:positionH>
+            <wp:positionV relativeFrom="paragraph">
+              <wp:posOffset>229270</wp:posOffset>
+            </wp:positionV>
+            <wp:extent cx="475461" cy="475461"/>
+            <wp:effectExtent l="0" t="0" r="1270" b="1270"/>
+            <wp:wrapNone/>
+            <wp:docPr id="979575333" name="図 1"/>
+            <wp:cNvGraphicFramePr>
+              <a:graphicFrameLocks xmlns:a="http://schemas.openxmlformats.org/drawingml/2006/main" noChangeAspect="1"/>
+            </wp:cNvGraphicFramePr>
+            <a:graphic xmlns:a="http://schemas.openxmlformats.org/drawingml/2006/main">
+              <a:graphicData uri="http://schemas.openxmlformats.org/drawingml/2006/picture">
+                <pic:pic xmlns:pic="http://schemas.openxmlformats.org/drawingml/2006/picture">
+                  <pic:nvPicPr>
+                    <pic:cNvPr id="979575333" name="図 979575333"/>
+                    <pic:cNvPicPr/>
+                  </pic:nvPicPr>
+                  <pic:blipFill>
+                    <a:blip r:embed="rId5" cstate="print">
+                      <a:extLst>
+                        <a:ext uri="{28A0092B-C50C-407E-A947-70E740481C1C}">
+                          <a14:useLocalDpi xmlns:a14="http://schemas.microsoft.com/office/drawing/2010/main" val="0"/>
+                        </a:ext>
+                      </a:extLst>
+                    </a:blip>
+                    <a:stretch>
+                      <a:fillRect/>
+                    </a:stretch>
+                  </pic:blipFill>
+                  <pic:spPr>
+                    <a:xfrm>
+                      <a:off x="0" y="0"/>
+                      <a:ext cx="475461" cy="475461"/>
+                    </a:xfrm>
+                    <a:prstGeom prst="rect">
+                      <a:avLst/>
+                    </a:prstGeom>
+                  </pic:spPr>
+                </pic:pic>
+              </a:graphicData>
+            </a:graphic>
+            <wp14:sizeRelH relativeFrom="margin">
+              <wp14:pctWidth>0</wp14:pctWidth>
+            </wp14:sizeRelH>
+            <wp14:sizeRelV relativeFrom="margin">
+              <wp14:pctHeight>0</wp14:pctHeight>
+            </wp14:sizeRelV>
+          </wp:anchor>
+        </w:drawing>
+      </w:r>
+      <w:r>
+        <w:rPr>
           <w:rFonts w:ascii="BIZ UDP明朝 Medium" w:eastAsia="BIZ UDP明朝 Medium" w:hAnsi="BIZ UDP明朝 Medium" w:hint="eastAsia"/>
         </w:rPr>
         <w:t xml:space="preserve">　　　　　　　　　　　　　　　　　　　　　　　　　　　　　　　　　Spurs株式会社</w:t>
@@ -2589,7 +2670,7 @@
         <w:rPr>
           <w:rFonts w:ascii="BIZ UDP明朝 Medium" w:eastAsia="BIZ UDP明朝 Medium" w:hAnsi="BIZ UDP明朝 Medium" w:hint="eastAsia"/>
         </w:rPr>
-        <w:t xml:space="preserve">　　　　　　　　　　　　　　　　　　　　　　　　　　　　　　　　　代表取締役　　伊佐地　將　　　　　　　　印</w:t>
+        <w:t xml:space="preserve">　　　　　　　　　　　　　　　　　　　　　　　　　　　　　　　　　代表取締役　　伊佐地　將　　　　　　　　</w:t>
       </w:r>
     </w:p>
     <w:p>

</xml_diff>